<commit_message>
Make sure logistic regression converges and perform cross validation
</commit_message>
<xml_diff>
--- a/reports/report.docx
+++ b/reports/report.docx
@@ -1111,7 +1111,13 @@
               <w:rPr>
                 <w:sz w:val="18"/>
               </w:rPr>
-              <w:t>0.985804</w:t>
+              <w:t>0</w:t>
+            </w:r>
+            <w:r>
+              <w:rPr>
+                <w:sz w:val="18"/>
+              </w:rPr>
+              <w:t>.981430</w:t>
             </w:r>
           </w:p>
         </w:tc>
@@ -1132,7 +1138,14 @@
                 <w:sz w:val="18"/>
                 <w:szCs w:val="18"/>
               </w:rPr>
-              <w:t>0.773246</w:t>
+              <w:t>0</w:t>
+            </w:r>
+            <w:r>
+              <w:rPr>
+                <w:sz w:val="18"/>
+                <w:szCs w:val="18"/>
+              </w:rPr>
+              <w:t>.723114</w:t>
             </w:r>
           </w:p>
         </w:tc>
@@ -1146,7 +1159,13 @@
               <w:rPr>
                 <w:sz w:val="18"/>
               </w:rPr>
-              <w:t>0.999799</w:t>
+              <w:t>0</w:t>
+            </w:r>
+            <w:r>
+              <w:rPr>
+                <w:sz w:val="18"/>
+              </w:rPr>
+              <w:t>.998695</w:t>
             </w:r>
           </w:p>
         </w:tc>
@@ -1160,7 +1179,13 @@
               <w:rPr>
                 <w:sz w:val="18"/>
               </w:rPr>
-              <w:t>0.872048</w:t>
+              <w:t>0</w:t>
+            </w:r>
+            <w:r>
+              <w:rPr>
+                <w:sz w:val="18"/>
+              </w:rPr>
+              <w:t>.838851</w:t>
             </w:r>
           </w:p>
         </w:tc>
@@ -1174,7 +1199,13 @@
               <w:rPr>
                 <w:sz w:val="18"/>
               </w:rPr>
-              <w:t>0.944456</w:t>
+              <w:t>0</w:t>
+            </w:r>
+            <w:r>
+              <w:rPr>
+                <w:sz w:val="18"/>
+              </w:rPr>
+              <w:t>.927965</w:t>
             </w:r>
           </w:p>
         </w:tc>
@@ -1195,7 +1226,14 @@
                 <w:sz w:val="18"/>
                 <w:szCs w:val="18"/>
               </w:rPr>
-              <w:t>0.872670</w:t>
+              <w:t>0</w:t>
+            </w:r>
+            <w:r>
+              <w:rPr>
+                <w:sz w:val="18"/>
+                <w:szCs w:val="18"/>
+              </w:rPr>
+              <w:t>.841452</w:t>
             </w:r>
           </w:p>
         </w:tc>
@@ -1209,7 +1247,13 @@
               <w:rPr>
                 <w:sz w:val="18"/>
               </w:rPr>
-              <w:t>0.998774</w:t>
+              <w:t>0</w:t>
+            </w:r>
+            <w:r>
+              <w:rPr>
+                <w:sz w:val="18"/>
+              </w:rPr>
+              <w:t>.994881</w:t>
             </w:r>
           </w:p>
         </w:tc>
@@ -1223,7 +1267,7 @@
               <w:rPr>
                 <w:sz w:val="18"/>
               </w:rPr>
-              <w:t>0.014907</w:t>
+              <w:t>0.019448</w:t>
             </w:r>
           </w:p>
         </w:tc>
@@ -1237,7 +1281,13 @@
               <w:rPr>
                 <w:sz w:val="18"/>
               </w:rPr>
-              <w:t>0.000201</w:t>
+              <w:t>0</w:t>
+            </w:r>
+            <w:r>
+              <w:rPr>
+                <w:sz w:val="18"/>
+              </w:rPr>
+              <w:t>.001305</w:t>
             </w:r>
           </w:p>
         </w:tc>
@@ -1277,7 +1327,14 @@
                 <w:sz w:val="18"/>
                 <w:szCs w:val="18"/>
               </w:rPr>
-              <w:t>0.986261</w:t>
+              <w:t>0</w:t>
+            </w:r>
+            <w:r>
+              <w:rPr>
+                <w:sz w:val="18"/>
+                <w:szCs w:val="18"/>
+              </w:rPr>
+              <w:t>.985935</w:t>
             </w:r>
           </w:p>
         </w:tc>
@@ -1291,7 +1348,7 @@
               <w:rPr>
                 <w:sz w:val="18"/>
               </w:rPr>
-              <w:t>0.779103</w:t>
+              <w:t>0.775050</w:t>
             </w:r>
           </w:p>
         </w:tc>
@@ -1305,7 +1362,13 @@
               <w:rPr>
                 <w:sz w:val="18"/>
               </w:rPr>
-              <w:t>0.999398</w:t>
+              <w:t>0</w:t>
+            </w:r>
+            <w:r>
+              <w:rPr>
+                <w:sz w:val="18"/>
+              </w:rPr>
+              <w:t>.999448</w:t>
             </w:r>
           </w:p>
         </w:tc>
@@ -1319,7 +1382,13 @@
               <w:rPr>
                 <w:sz w:val="18"/>
               </w:rPr>
-              <w:t>0.875607</w:t>
+              <w:t>0</w:t>
+            </w:r>
+            <w:r>
+              <w:rPr>
+                <w:sz w:val="18"/>
+              </w:rPr>
+              <w:t>.873060</w:t>
             </w:r>
           </w:p>
         </w:tc>
@@ -1333,7 +1402,13 @@
               <w:rPr>
                 <w:sz w:val="18"/>
               </w:rPr>
-              <w:t>0.945906</w:t>
+              <w:t>0</w:t>
+            </w:r>
+            <w:r>
+              <w:rPr>
+                <w:sz w:val="18"/>
+              </w:rPr>
+              <w:t>.944742</w:t>
             </w:r>
           </w:p>
         </w:tc>
@@ -1347,7 +1422,13 @@
               <w:rPr>
                 <w:sz w:val="18"/>
               </w:rPr>
-              <w:t>0.876002</w:t>
+              <w:t>0</w:t>
+            </w:r>
+            <w:r>
+              <w:rPr>
+                <w:sz w:val="18"/>
+              </w:rPr>
+              <w:t>.873590</w:t>
             </w:r>
           </w:p>
         </w:tc>
@@ -1361,7 +1442,13 @@
               <w:rPr>
                 <w:sz w:val="18"/>
               </w:rPr>
-              <w:t>0.996607</w:t>
+              <w:t>0</w:t>
+            </w:r>
+            <w:r>
+              <w:rPr>
+                <w:sz w:val="18"/>
+              </w:rPr>
+              <w:t>.998694</w:t>
             </w:r>
           </w:p>
         </w:tc>
@@ -1426,7 +1513,7 @@
                       <w:szCs w:val="18"/>
                       <w:lang w:bidi="he-IL"/>
                     </w:rPr>
-                    <w:t>0.014407</w:t>
+                    <w:t>0.014752</w:t>
                   </w:r>
                 </w:p>
               </w:tc>
@@ -1476,12 +1563,692 @@
               <w:rPr>
                 <w:sz w:val="18"/>
               </w:rPr>
-              <w:t>0.000602</w:t>
+              <w:t>0</w:t>
+            </w:r>
+            <w:r>
+              <w:rPr>
+                <w:sz w:val="18"/>
+              </w:rPr>
+              <w:t>.000552</w:t>
             </w:r>
           </w:p>
         </w:tc>
       </w:tr>
     </w:tbl>
+    <w:p/>
+    <w:p>
+      <w:pPr>
+        <w:pStyle w:val="Heading3"/>
+      </w:pPr>
+      <w:r>
+        <w:t>Cross Validation Results</w:t>
+      </w:r>
+      <w:r>
+        <w:t xml:space="preserve"> (k=3)</w:t>
+      </w:r>
+      <w:r>
+        <w:t>:</w:t>
+      </w:r>
+    </w:p>
+    <w:tbl>
+      <w:tblPr>
+        <w:tblStyle w:val="TableGrid"/>
+        <w:tblW w:w="0" w:type="auto"/>
+        <w:jc w:val="center"/>
+        <w:tblLook w:val="04A0" w:firstRow="1" w:lastRow="0" w:firstColumn="1" w:lastColumn="0" w:noHBand="0" w:noVBand="1"/>
+      </w:tblPr>
+      <w:tblGrid>
+        <w:gridCol w:w="1127"/>
+        <w:gridCol w:w="967"/>
+        <w:gridCol w:w="967"/>
+        <w:gridCol w:w="967"/>
+        <w:gridCol w:w="967"/>
+        <w:gridCol w:w="967"/>
+        <w:gridCol w:w="967"/>
+        <w:gridCol w:w="1087"/>
+        <w:gridCol w:w="1453"/>
+      </w:tblGrid>
+      <w:tr>
+        <w:trPr>
+          <w:jc w:val="center"/>
+        </w:trPr>
+        <w:tc>
+          <w:tcPr>
+            <w:tcW w:w="1080" w:type="dxa"/>
+            <w:vAlign w:val="center"/>
+          </w:tcPr>
+          <w:p>
+            <w:pPr>
+              <w:jc w:val="center"/>
+            </w:pPr>
+            <w:r>
+              <w:rPr>
+                <w:b/>
+                <w:sz w:val="18"/>
+              </w:rPr>
+              <w:t>Model</w:t>
+            </w:r>
+          </w:p>
+        </w:tc>
+        <w:tc>
+          <w:tcPr>
+            <w:tcW w:w="928" w:type="dxa"/>
+            <w:vAlign w:val="center"/>
+          </w:tcPr>
+          <w:p>
+            <w:pPr>
+              <w:jc w:val="center"/>
+            </w:pPr>
+            <w:r>
+              <w:rPr>
+                <w:b/>
+                <w:sz w:val="18"/>
+              </w:rPr>
+              <w:t>F2-mean</w:t>
+            </w:r>
+          </w:p>
+        </w:tc>
+        <w:tc>
+          <w:tcPr>
+            <w:tcW w:w="929" w:type="dxa"/>
+            <w:vAlign w:val="center"/>
+          </w:tcPr>
+          <w:p>
+            <w:pPr>
+              <w:jc w:val="center"/>
+            </w:pPr>
+            <w:r>
+              <w:rPr>
+                <w:b/>
+                <w:sz w:val="18"/>
+              </w:rPr>
+              <w:t>F2-std</w:t>
+            </w:r>
+          </w:p>
+        </w:tc>
+        <w:tc>
+          <w:tcPr>
+            <w:tcW w:w="929" w:type="dxa"/>
+            <w:vAlign w:val="center"/>
+          </w:tcPr>
+          <w:p>
+            <w:pPr>
+              <w:jc w:val="center"/>
+            </w:pPr>
+            <w:r>
+              <w:rPr>
+                <w:b/>
+                <w:sz w:val="18"/>
+              </w:rPr>
+              <w:t>MCC-mean</w:t>
+            </w:r>
+          </w:p>
+        </w:tc>
+        <w:tc>
+          <w:tcPr>
+            <w:tcW w:w="929" w:type="dxa"/>
+            <w:vAlign w:val="center"/>
+          </w:tcPr>
+          <w:p>
+            <w:pPr>
+              <w:jc w:val="center"/>
+            </w:pPr>
+            <w:r>
+              <w:rPr>
+                <w:b/>
+                <w:sz w:val="18"/>
+              </w:rPr>
+              <w:t>MCC-std</w:t>
+            </w:r>
+          </w:p>
+        </w:tc>
+        <w:tc>
+          <w:tcPr>
+            <w:tcW w:w="929" w:type="dxa"/>
+            <w:vAlign w:val="center"/>
+          </w:tcPr>
+          <w:p>
+            <w:pPr>
+              <w:jc w:val="center"/>
+            </w:pPr>
+            <w:r>
+              <w:rPr>
+                <w:b/>
+                <w:sz w:val="18"/>
+              </w:rPr>
+              <w:t>ROC-AUC-mean</w:t>
+            </w:r>
+          </w:p>
+        </w:tc>
+        <w:tc>
+          <w:tcPr>
+            <w:tcW w:w="929" w:type="dxa"/>
+            <w:vAlign w:val="center"/>
+          </w:tcPr>
+          <w:p>
+            <w:pPr>
+              <w:jc w:val="center"/>
+            </w:pPr>
+            <w:r>
+              <w:rPr>
+                <w:b/>
+                <w:sz w:val="18"/>
+              </w:rPr>
+              <w:t>ROC-AUC-std</w:t>
+            </w:r>
+          </w:p>
+        </w:tc>
+        <w:tc>
+          <w:tcPr>
+            <w:tcW w:w="929" w:type="dxa"/>
+            <w:vAlign w:val="center"/>
+          </w:tcPr>
+          <w:p>
+            <w:pPr>
+              <w:jc w:val="center"/>
+            </w:pPr>
+            <w:r>
+              <w:rPr>
+                <w:b/>
+                <w:sz w:val="18"/>
+              </w:rPr>
+              <w:t>Average-Precision-mean</w:t>
+            </w:r>
+          </w:p>
+        </w:tc>
+        <w:tc>
+          <w:tcPr>
+            <w:tcW w:w="1415" w:type="dxa"/>
+            <w:vAlign w:val="center"/>
+          </w:tcPr>
+          <w:p>
+            <w:pPr>
+              <w:jc w:val="center"/>
+            </w:pPr>
+            <w:r>
+              <w:rPr>
+                <w:b/>
+                <w:sz w:val="18"/>
+              </w:rPr>
+              <w:t>Average-Precision-std</w:t>
+            </w:r>
+          </w:p>
+        </w:tc>
+      </w:tr>
+      <w:tr>
+        <w:trPr>
+          <w:jc w:val="center"/>
+        </w:trPr>
+        <w:tc>
+          <w:tcPr>
+            <w:tcW w:w="1080" w:type="dxa"/>
+            <w:vAlign w:val="center"/>
+          </w:tcPr>
+          <w:p>
+            <w:r>
+              <w:rPr>
+                <w:sz w:val="18"/>
+              </w:rPr>
+              <w:t>Logistic Regression</w:t>
+            </w:r>
+          </w:p>
+        </w:tc>
+        <w:tc>
+          <w:tcPr>
+            <w:tcW w:w="928" w:type="dxa"/>
+            <w:vAlign w:val="center"/>
+          </w:tcPr>
+          <w:p>
+            <w:r>
+              <w:rPr>
+                <w:sz w:val="18"/>
+              </w:rPr>
+              <w:t>0</w:t>
+            </w:r>
+            <w:r>
+              <w:rPr>
+                <w:sz w:val="18"/>
+              </w:rPr>
+              <w:t>.922132</w:t>
+            </w:r>
+          </w:p>
+        </w:tc>
+        <w:tc>
+          <w:tcPr>
+            <w:tcW w:w="929" w:type="dxa"/>
+            <w:vAlign w:val="center"/>
+          </w:tcPr>
+          <w:p>
+            <w:pPr>
+              <w:rPr>
+                <w:sz w:val="18"/>
+                <w:szCs w:val="18"/>
+              </w:rPr>
+            </w:pPr>
+            <w:r>
+              <w:rPr>
+                <w:sz w:val="18"/>
+                <w:szCs w:val="18"/>
+              </w:rPr>
+              <w:t>0</w:t>
+            </w:r>
+            <w:r>
+              <w:rPr>
+                <w:sz w:val="18"/>
+                <w:szCs w:val="18"/>
+              </w:rPr>
+              <w:t>.009261</w:t>
+            </w:r>
+          </w:p>
+        </w:tc>
+        <w:tc>
+          <w:tcPr>
+            <w:tcW w:w="929" w:type="dxa"/>
+            <w:vAlign w:val="center"/>
+          </w:tcPr>
+          <w:p>
+            <w:r>
+              <w:rPr>
+                <w:sz w:val="18"/>
+              </w:rPr>
+              <w:t>0</w:t>
+            </w:r>
+            <w:r>
+              <w:rPr>
+                <w:sz w:val="18"/>
+              </w:rPr>
+              <w:t>.830536</w:t>
+            </w:r>
+          </w:p>
+        </w:tc>
+        <w:tc>
+          <w:tcPr>
+            <w:tcW w:w="929" w:type="dxa"/>
+            <w:vAlign w:val="center"/>
+          </w:tcPr>
+          <w:p>
+            <w:r>
+              <w:rPr>
+                <w:sz w:val="18"/>
+              </w:rPr>
+              <w:t>0</w:t>
+            </w:r>
+            <w:r>
+              <w:rPr>
+                <w:sz w:val="18"/>
+              </w:rPr>
+              <w:t>.017214</w:t>
+            </w:r>
+          </w:p>
+        </w:tc>
+        <w:tc>
+          <w:tcPr>
+            <w:tcW w:w="929" w:type="dxa"/>
+            <w:vAlign w:val="center"/>
+          </w:tcPr>
+          <w:p>
+            <w:r>
+              <w:rPr>
+                <w:sz w:val="18"/>
+              </w:rPr>
+              <w:t>0</w:t>
+            </w:r>
+            <w:r>
+              <w:rPr>
+                <w:sz w:val="18"/>
+              </w:rPr>
+              <w:t>.994069</w:t>
+            </w:r>
+          </w:p>
+        </w:tc>
+        <w:tc>
+          <w:tcPr>
+            <w:tcW w:w="929" w:type="dxa"/>
+            <w:vAlign w:val="center"/>
+          </w:tcPr>
+          <w:p>
+            <w:pPr>
+              <w:rPr>
+                <w:sz w:val="18"/>
+                <w:szCs w:val="18"/>
+              </w:rPr>
+            </w:pPr>
+            <w:r>
+              <w:rPr>
+                <w:sz w:val="18"/>
+                <w:szCs w:val="18"/>
+              </w:rPr>
+              <w:t>0</w:t>
+            </w:r>
+            <w:r>
+              <w:rPr>
+                <w:sz w:val="18"/>
+                <w:szCs w:val="18"/>
+              </w:rPr>
+              <w:t>.000029</w:t>
+            </w:r>
+          </w:p>
+        </w:tc>
+        <w:tc>
+          <w:tcPr>
+            <w:tcW w:w="929" w:type="dxa"/>
+            <w:vAlign w:val="center"/>
+          </w:tcPr>
+          <w:p>
+            <w:r>
+              <w:rPr>
+                <w:sz w:val="18"/>
+              </w:rPr>
+              <w:t>0</w:t>
+            </w:r>
+            <w:r>
+              <w:rPr>
+                <w:sz w:val="18"/>
+              </w:rPr>
+              <w:t>.824066</w:t>
+            </w:r>
+          </w:p>
+        </w:tc>
+        <w:tc>
+          <w:tcPr>
+            <w:tcW w:w="1415" w:type="dxa"/>
+            <w:vAlign w:val="center"/>
+          </w:tcPr>
+          <w:p>
+            <w:r>
+              <w:rPr>
+                <w:sz w:val="18"/>
+              </w:rPr>
+              <w:t>0</w:t>
+            </w:r>
+            <w:r>
+              <w:rPr>
+                <w:sz w:val="18"/>
+              </w:rPr>
+              <w:t>.001075</w:t>
+            </w:r>
+          </w:p>
+        </w:tc>
+      </w:tr>
+      <w:tr>
+        <w:trPr>
+          <w:jc w:val="center"/>
+        </w:trPr>
+        <w:tc>
+          <w:tcPr>
+            <w:tcW w:w="1080" w:type="dxa"/>
+            <w:vAlign w:val="center"/>
+          </w:tcPr>
+          <w:p>
+            <w:r>
+              <w:rPr>
+                <w:sz w:val="18"/>
+              </w:rPr>
+              <w:t>Decision Tree</w:t>
+            </w:r>
+          </w:p>
+        </w:tc>
+        <w:tc>
+          <w:tcPr>
+            <w:tcW w:w="928" w:type="dxa"/>
+            <w:vAlign w:val="center"/>
+          </w:tcPr>
+          <w:p>
+            <w:pPr>
+              <w:rPr>
+                <w:sz w:val="18"/>
+                <w:szCs w:val="18"/>
+              </w:rPr>
+            </w:pPr>
+            <w:r>
+              <w:rPr>
+                <w:sz w:val="18"/>
+                <w:szCs w:val="18"/>
+              </w:rPr>
+              <w:t>0</w:t>
+            </w:r>
+            <w:r>
+              <w:rPr>
+                <w:sz w:val="18"/>
+                <w:szCs w:val="18"/>
+              </w:rPr>
+              <w:t>.945187</w:t>
+            </w:r>
+          </w:p>
+        </w:tc>
+        <w:tc>
+          <w:tcPr>
+            <w:tcW w:w="929" w:type="dxa"/>
+            <w:vAlign w:val="center"/>
+          </w:tcPr>
+          <w:p>
+            <w:r>
+              <w:rPr>
+                <w:sz w:val="18"/>
+              </w:rPr>
+              <w:t>0</w:t>
+            </w:r>
+            <w:r>
+              <w:rPr>
+                <w:sz w:val="18"/>
+              </w:rPr>
+              <w:t>.000105</w:t>
+            </w:r>
+          </w:p>
+        </w:tc>
+        <w:tc>
+          <w:tcPr>
+            <w:tcW w:w="929" w:type="dxa"/>
+            <w:vAlign w:val="center"/>
+          </w:tcPr>
+          <w:p>
+            <w:r>
+              <w:rPr>
+                <w:sz w:val="18"/>
+              </w:rPr>
+              <w:t>0</w:t>
+            </w:r>
+            <w:r>
+              <w:rPr>
+                <w:sz w:val="18"/>
+              </w:rPr>
+              <w:t>.874750</w:t>
+            </w:r>
+          </w:p>
+        </w:tc>
+        <w:tc>
+          <w:tcPr>
+            <w:tcW w:w="929" w:type="dxa"/>
+            <w:vAlign w:val="center"/>
+          </w:tcPr>
+          <w:p>
+            <w:r>
+              <w:rPr>
+                <w:sz w:val="18"/>
+              </w:rPr>
+              <w:t>0</w:t>
+            </w:r>
+            <w:r>
+              <w:rPr>
+                <w:sz w:val="18"/>
+              </w:rPr>
+              <w:t>.000216</w:t>
+            </w:r>
+          </w:p>
+        </w:tc>
+        <w:tc>
+          <w:tcPr>
+            <w:tcW w:w="929" w:type="dxa"/>
+            <w:vAlign w:val="center"/>
+          </w:tcPr>
+          <w:p>
+            <w:r>
+              <w:rPr>
+                <w:sz w:val="18"/>
+              </w:rPr>
+              <w:t>0</w:t>
+            </w:r>
+            <w:r>
+              <w:rPr>
+                <w:sz w:val="18"/>
+              </w:rPr>
+              <w:t>.998626</w:t>
+            </w:r>
+          </w:p>
+        </w:tc>
+        <w:tc>
+          <w:tcPr>
+            <w:tcW w:w="929" w:type="dxa"/>
+            <w:vAlign w:val="center"/>
+          </w:tcPr>
+          <w:p>
+            <w:r>
+              <w:rPr>
+                <w:sz w:val="18"/>
+              </w:rPr>
+              <w:t>0</w:t>
+            </w:r>
+            <w:r>
+              <w:rPr>
+                <w:sz w:val="18"/>
+              </w:rPr>
+              <w:t>.000119</w:t>
+            </w:r>
+          </w:p>
+        </w:tc>
+        <w:tc>
+          <w:tcPr>
+            <w:tcW w:w="929" w:type="dxa"/>
+            <w:vAlign w:val="center"/>
+          </w:tcPr>
+          <w:p>
+            <w:r>
+              <w:rPr>
+                <w:sz w:val="18"/>
+              </w:rPr>
+              <w:t>0</w:t>
+            </w:r>
+            <w:r>
+              <w:rPr>
+                <w:sz w:val="18"/>
+              </w:rPr>
+              <w:t>.973370</w:t>
+            </w:r>
+          </w:p>
+        </w:tc>
+        <w:tc>
+          <w:tcPr>
+            <w:tcW w:w="1415" w:type="dxa"/>
+            <w:vAlign w:val="center"/>
+          </w:tcPr>
+          <w:tbl>
+            <w:tblPr>
+              <w:tblW w:w="0" w:type="auto"/>
+              <w:shd w:val="clear" w:color="auto" w:fill="FFFFFF"/>
+              <w:tblCellMar>
+                <w:top w:w="15" w:type="dxa"/>
+                <w:left w:w="15" w:type="dxa"/>
+                <w:bottom w:w="15" w:type="dxa"/>
+                <w:right w:w="15" w:type="dxa"/>
+              </w:tblCellMar>
+              <w:tblLook w:val="04A0" w:firstRow="1" w:lastRow="0" w:firstColumn="1" w:lastColumn="0" w:noHBand="0" w:noVBand="1"/>
+            </w:tblPr>
+            <w:tblGrid>
+              <w:gridCol w:w="991"/>
+              <w:gridCol w:w="246"/>
+            </w:tblGrid>
+            <w:tr>
+              <w:tc>
+                <w:tcPr>
+                  <w:tcW w:w="0" w:type="auto"/>
+                  <w:tcBorders>
+                    <w:top w:val="nil"/>
+                    <w:left w:val="nil"/>
+                    <w:bottom w:val="nil"/>
+                    <w:right w:val="nil"/>
+                  </w:tcBorders>
+                  <w:shd w:val="clear" w:color="auto" w:fill="FFFFFF"/>
+                  <w:tcMar>
+                    <w:top w:w="120" w:type="dxa"/>
+                    <w:left w:w="120" w:type="dxa"/>
+                    <w:bottom w:w="120" w:type="dxa"/>
+                    <w:right w:w="120" w:type="dxa"/>
+                  </w:tcMar>
+                  <w:vAlign w:val="center"/>
+                  <w:hideMark/>
+                </w:tcPr>
+                <w:p>
+                  <w:pPr>
+                    <w:spacing w:after="0" w:line="240" w:lineRule="auto"/>
+                    <w:jc w:val="right"/>
+                    <w:rPr>
+                      <w:rFonts w:eastAsia="Times New Roman" w:cs="Arial"/>
+                      <w:color w:val="1F1F1F"/>
+                      <w:sz w:val="18"/>
+                      <w:szCs w:val="18"/>
+                      <w:lang w:bidi="he-IL"/>
+                    </w:rPr>
+                  </w:pPr>
+                  <w:r>
+                    <w:rPr>
+                      <w:rFonts w:eastAsia="Times New Roman" w:cs="Arial"/>
+                      <w:color w:val="1F1F1F"/>
+                      <w:sz w:val="18"/>
+                      <w:szCs w:val="18"/>
+                      <w:lang w:bidi="he-IL"/>
+                    </w:rPr>
+                    <w:t>0</w:t>
+                  </w:r>
+                  <w:r>
+                    <w:rPr>
+                      <w:rFonts w:eastAsia="Times New Roman" w:cs="Arial"/>
+                      <w:color w:val="1F1F1F"/>
+                      <w:sz w:val="18"/>
+                      <w:szCs w:val="18"/>
+                      <w:lang w:bidi="he-IL"/>
+                    </w:rPr>
+                    <w:t>.000906</w:t>
+                  </w:r>
+                </w:p>
+              </w:tc>
+              <w:tc>
+                <w:tcPr>
+                  <w:tcW w:w="0" w:type="auto"/>
+                  <w:tcBorders>
+                    <w:top w:val="nil"/>
+                    <w:left w:val="nil"/>
+                    <w:bottom w:val="nil"/>
+                    <w:right w:val="nil"/>
+                  </w:tcBorders>
+                  <w:shd w:val="clear" w:color="auto" w:fill="FFFFFF"/>
+                  <w:tcMar>
+                    <w:top w:w="120" w:type="dxa"/>
+                    <w:left w:w="120" w:type="dxa"/>
+                    <w:bottom w:w="120" w:type="dxa"/>
+                    <w:right w:w="120" w:type="dxa"/>
+                  </w:tcMar>
+                  <w:vAlign w:val="center"/>
+                  <w:hideMark/>
+                </w:tcPr>
+                <w:p>
+                  <w:pPr>
+                    <w:spacing w:after="0" w:line="240" w:lineRule="auto"/>
+                    <w:jc w:val="right"/>
+                    <w:rPr>
+                      <w:rFonts w:eastAsia="Times New Roman" w:cs="Arial"/>
+                      <w:color w:val="1F1F1F"/>
+                      <w:szCs w:val="21"/>
+                      <w:lang w:bidi="he-IL"/>
+                    </w:rPr>
+                  </w:pPr>
+                </w:p>
+              </w:tc>
+            </w:tr>
+          </w:tbl>
+          <w:p/>
+        </w:tc>
+      </w:tr>
+    </w:tbl>
     <w:p>
       <w:r>
         <w:t xml:space="preserve">Based on the </w:t>
@@ -1501,10 +2268,10 @@
         <w:t xml:space="preserve">It achieved the strongest overall balance between attack detection and false-alarm control, with </w:t>
       </w:r>
       <w:r>
-        <w:t>F1 of 0.</w:t>
-      </w:r>
-      <w:r>
-        <w:t>875</w:t>
+        <w:t>F1 of 0</w:t>
+      </w:r>
+      <w:r>
+        <w:t>.873</w:t>
       </w:r>
       <w:r>
         <w:t>.</w:t>
@@ -1540,7 +2307,11 @@
     </w:p>
     <w:p>
       <w:r>
-        <w:t>Therefore, the most meaningful interpretation of the results comes from combining aggregate metrics with confusion matrices, false positive and false negative rates, and error analysis by attack category. The results support the use of machine learning as a useful approach for IDS modeling, but they do not fully prove that the model would generalize to real-world network environments without further validation.</w:t>
+        <w:t xml:space="preserve">Therefore, the most meaningful interpretation of the results comes from combining aggregate metrics with confusion matrices, false positive and false negative rates, and error analysis by attack category. The </w:t>
+      </w:r>
+      <w:r>
+        <w:lastRenderedPageBreak/>
+        <w:t>results support the use of machine learning as a useful approach for IDS modeling, but they do not fully prove that the model would generalize to real-world network environments without further validation.</w:t>
       </w:r>
     </w:p>
     <w:p>
@@ -1558,7 +2329,6 @@
     </w:p>
     <w:p>
       <w:r>
-        <w:lastRenderedPageBreak/>
         <w:t>The reproduction results were close to the original blog’s reported behavior, especially after switching from the smaller predefined train-test dataset to the full four-file UNSW-NB15 CSV dataset. This shows that the dataset version has a major effect on reproducibility. Once the full dataset was used, the experimental setup became much more consistent with the source, and the results were more comparable to the author’s claims.</w:t>
       </w:r>
     </w:p>
@@ -2407,7 +3177,6 @@
   <w:style w:type="character" w:default="1" w:styleId="DefaultParagraphFont">
     <w:name w:val="Default Paragraph Font"/>
     <w:uiPriority w:val="1"/>
-    <w:semiHidden/>
     <w:unhideWhenUsed/>
   </w:style>
   <w:style w:type="table" w:default="1" w:styleId="TableNormal">

</xml_diff>